<commit_message>
Finalise les workflows, l interface et la gouvernance IA
</commit_message>
<xml_diff>
--- a/docs/MANUEL_UTILISATION_E_PILOTAGE_PAS.docx
+++ b/docs/MANUEL_UTILISATION_E_PILOTAGE_PAS.docx
@@ -10,7 +10,7 @@
         <w:drawing>
           <wp:inline xmlns:a="http://schemas.openxmlformats.org/drawingml/2006/main" xmlns:pic="http://schemas.openxmlformats.org/drawingml/2006/picture">
             <wp:extent cx="2103120" cy="1241141"/>
-            <wp:docPr id="1" name="Picture 1"/>
+            <wp:docPr id="1" name="Picture 1" descr="Illustration fonctionnelle e-Pilotage 1" title="Illustration 1"/>
             <wp:cNvGraphicFramePr>
               <a:graphicFrameLocks noChangeAspect="1"/>
             </wp:cNvGraphicFramePr>
@@ -83,6 +83,9 @@
         <w:gridCol w:w="5600"/>
       </w:tblGrid>
       <w:tr>
+        <w:trPr>
+          <w:tblHeader w:val="true"/>
+        </w:trPr>
         <w:tc>
           <w:tcPr>
             <w:tcW w:type="dxa" w:w="2600"/>
@@ -215,7 +218,7 @@
                 <w:color w:val="000000"/>
                 <w:sz w:val="20"/>
               </w:rPr>
-              <w:t>Version 1.0 - 14 juin 2026</w:t>
+              <w:t>Version 2.0 - 27 juillet 2026</w:t>
             </w:r>
           </w:p>
         </w:tc>
@@ -280,6 +283,9 @@
         <w:gridCol w:w="9360"/>
       </w:tblGrid>
       <w:tr>
+        <w:trPr>
+          <w:tblHeader w:val="true"/>
+        </w:trPr>
         <w:tc>
           <w:tcPr>
             <w:tcW w:type="dxa" w:w="9360"/>
@@ -341,7 +347,7 @@
         <w:drawing>
           <wp:inline xmlns:a="http://schemas.openxmlformats.org/drawingml/2006/main" xmlns:pic="http://schemas.openxmlformats.org/drawingml/2006/picture">
             <wp:extent cx="5760720" cy="1792224"/>
-            <wp:docPr id="2" name="Picture 2"/>
+            <wp:docPr id="2" name="Picture 2" descr="Illustration fonctionnelle e-Pilotage 2" title="Illustration 2"/>
             <wp:cNvGraphicFramePr>
               <a:graphicFrameLocks noChangeAspect="1"/>
             </wp:cNvGraphicFramePr>
@@ -473,6 +479,9 @@
         <w:gridCol w:w="9360"/>
       </w:tblGrid>
       <w:tr>
+        <w:trPr>
+          <w:tblHeader w:val="true"/>
+        </w:trPr>
         <w:tc>
           <w:tcPr>
             <w:tcW w:type="dxa" w:w="9360"/>
@@ -500,7 +509,7 @@
                 <w:color w:val="000000"/>
                 <w:sz w:val="22"/>
               </w:rPr>
-              <w:t>Le PTA définit les règles de l'action. Le suivi applique ces règles. La validation du chef officialise la performance. Le reporting utilise la performance officielle.</w:t>
+              <w:t>Le PTA définit les règles de l'action. Le suivi applique ces règles. Le chef donne son visa, puis le contrôle Planification/SCIQ officialise la performance utilisée dans le reporting.</w:t>
             </w:r>
           </w:p>
         </w:tc>
@@ -530,6 +539,9 @@
         <w:gridCol w:w="3610"/>
       </w:tblGrid>
       <w:tr>
+        <w:trPr>
+          <w:tblHeader w:val="true"/>
+        </w:trPr>
         <w:tc>
           <w:tcPr>
             <w:tcW w:type="dxa" w:w="1900"/>
@@ -1308,7 +1320,7 @@
         <w:drawing>
           <wp:inline xmlns:a="http://schemas.openxmlformats.org/drawingml/2006/main" xmlns:pic="http://schemas.openxmlformats.org/drawingml/2006/picture">
             <wp:extent cx="5760720" cy="3049793"/>
-            <wp:docPr id="3" name="Picture 3"/>
+            <wp:docPr id="3" name="Picture 3" descr="Illustration fonctionnelle e-Pilotage 3" title="Illustration 3"/>
             <wp:cNvGraphicFramePr>
               <a:graphicFrameLocks noChangeAspect="1"/>
             </wp:cNvGraphicFramePr>
@@ -1363,6 +1375,9 @@
         <w:gridCol w:w="4960"/>
       </w:tblGrid>
       <w:tr>
+        <w:trPr>
+          <w:tblHeader w:val="true"/>
+        </w:trPr>
         <w:tc>
           <w:tcPr>
             <w:tcW w:type="dxa" w:w="2300"/>
@@ -2075,6 +2090,9 @@
         <w:gridCol w:w="9360"/>
       </w:tblGrid>
       <w:tr>
+        <w:trPr>
+          <w:tblHeader w:val="true"/>
+        </w:trPr>
         <w:tc>
           <w:tcPr>
             <w:tcW w:type="dxa" w:w="9360"/>
@@ -2235,6 +2253,9 @@
         <w:gridCol w:w="9360"/>
       </w:tblGrid>
       <w:tr>
+        <w:trPr>
+          <w:tblHeader w:val="true"/>
+        </w:trPr>
         <w:tc>
           <w:tcPr>
             <w:tcW w:type="dxa" w:w="9360"/>
@@ -2291,7 +2312,7 @@
         <w:drawing>
           <wp:inline xmlns:a="http://schemas.openxmlformats.org/drawingml/2006/main" xmlns:pic="http://schemas.openxmlformats.org/drawingml/2006/picture">
             <wp:extent cx="5760720" cy="3240405"/>
-            <wp:docPr id="4" name="Picture 4"/>
+            <wp:docPr id="4" name="Picture 4" descr="Illustration fonctionnelle e-Pilotage 4" title="Illustration 4"/>
             <wp:cNvGraphicFramePr>
               <a:graphicFrameLocks noChangeAspect="1"/>
             </wp:cNvGraphicFramePr>
@@ -2346,6 +2367,9 @@
         <w:gridCol w:w="4460"/>
       </w:tblGrid>
       <w:tr>
+        <w:trPr>
+          <w:tblHeader w:val="true"/>
+        </w:trPr>
         <w:tc>
           <w:tcPr>
             <w:tcW w:type="dxa" w:w="1900"/>
@@ -2552,7 +2576,7 @@
                 <w:color w:val="000000"/>
                 <w:sz w:val="18"/>
               </w:rPr>
-              <w:t>PAS, PAO, PTA, Imports Excel</w:t>
+              <w:t>PAS, PAO, PTA, Imports</w:t>
             </w:r>
           </w:p>
         </w:tc>
@@ -2577,7 +2601,7 @@
                 <w:color w:val="000000"/>
                 <w:sz w:val="18"/>
               </w:rPr>
-              <w:t>Création et structuration de la planification.</w:t>
+              <w:t>Création, structuration et imports classiques ou assistés.</w:t>
             </w:r>
           </w:p>
         </w:tc>
@@ -3040,6 +3064,77 @@
     </w:p>
     <w:p>
       <w:pPr>
+        <w:pStyle w:val="Heading2"/>
+      </w:pPr>
+      <w:r>
+        <w:t>Tableaux de bord par profil</w:t>
+      </w:r>
+    </w:p>
+    <w:p>
+      <w:pPr>
+        <w:pStyle w:val="ListBullet"/>
+        <w:spacing w:after="80"/>
+      </w:pPr>
+      <w:r>
+        <w:t>DG : synthèse institutionnelle, arbitrages, alertes critiques et consolidation globale.</w:t>
+      </w:r>
+    </w:p>
+    <w:p>
+      <w:pPr>
+        <w:pStyle w:val="ListBullet"/>
+        <w:spacing w:after="80"/>
+      </w:pPr>
+      <w:r>
+        <w:t>Direction : résultats de la direction, comparaison des services et dossiers à traiter.</w:t>
+      </w:r>
+    </w:p>
+    <w:p>
+      <w:pPr>
+        <w:pStyle w:val="ListBullet"/>
+        <w:spacing w:after="80"/>
+      </w:pPr>
+      <w:r>
+        <w:t>Chef de service : PTA du service, actions, validations en attente et retards.</w:t>
+      </w:r>
+    </w:p>
+    <w:p>
+      <w:pPr>
+        <w:pStyle w:val="ListBullet"/>
+        <w:spacing w:after="80"/>
+      </w:pPr>
+      <w:r>
+        <w:t>Agent / RMO : actions assignées, progression personnelle, corrections et échéances.</w:t>
+      </w:r>
+    </w:p>
+    <w:p>
+      <w:pPr>
+        <w:pStyle w:val="ListBullet"/>
+        <w:spacing w:after="80"/>
+      </w:pPr>
+      <w:r>
+        <w:t>Planification / SCIQ : couverture PAS-PAO-PTA, avancement global, contrôle et qualité des données.</w:t>
+      </w:r>
+    </w:p>
+    <w:p>
+      <w:pPr>
+        <w:pStyle w:val="ListBullet"/>
+        <w:spacing w:after="80"/>
+      </w:pPr>
+      <w:r>
+        <w:t>Le Super Admin peut activer, ordonner et dimensionner les cartes et graphiques par profil.</w:t>
+      </w:r>
+    </w:p>
+    <w:p>
+      <w:pPr>
+        <w:pStyle w:val="ListBullet"/>
+        <w:spacing w:after="80"/>
+      </w:pPr>
+      <w:r>
+        <w:t>Un clic sur une carte conserve les filtres utiles et ouvre la vue détaillée autorisée.</w:t>
+      </w:r>
+    </w:p>
+    <w:p>
+      <w:pPr>
         <w:pStyle w:val="Heading1"/>
       </w:pPr>
       <w:r>
@@ -3140,6 +3235,9 @@
         <w:gridCol w:w="5360"/>
       </w:tblGrid>
       <w:tr>
+        <w:trPr>
+          <w:tblHeader w:val="true"/>
+        </w:trPr>
         <w:tc>
           <w:tcPr>
             <w:tcW w:type="dxa" w:w="2300"/>
@@ -3721,6 +3819,55 @@
         <w:t>L'archivage intervient après clôture et conserve la traçabilité.</w:t>
       </w:r>
     </w:p>
+    <w:tbl>
+      <w:tblPr>
+        <w:tblW w:type="dxa" w:w="9360"/>
+        <w:jc w:val="left"/>
+        <w:tblLayout w:type="fixed"/>
+        <w:tblLook w:firstColumn="1" w:firstRow="1" w:lastColumn="0" w:lastRow="0" w:noHBand="0" w:noVBand="1" w:val="04A0"/>
+        <w:tblInd w:w="120" w:type="dxa"/>
+      </w:tblPr>
+      <w:tblGrid>
+        <w:gridCol w:w="9360"/>
+      </w:tblGrid>
+      <w:tr>
+        <w:trPr>
+          <w:tblHeader w:val="true"/>
+        </w:trPr>
+        <w:tc>
+          <w:tcPr>
+            <w:tcW w:type="dxa" w:w="9360"/>
+            <w:shd w:fill="F4F6F9"/>
+            <w:tcMar>
+              <w:top w:w="120" w:type="dxa"/>
+              <w:start w:w="160" w:type="dxa"/>
+              <w:bottom w:w="120" w:type="dxa"/>
+              <w:end w:w="160" w:type="dxa"/>
+            </w:tcMar>
+          </w:tcPr>
+          <w:p>
+            <w:r>
+              <w:rPr>
+                <w:rFonts w:ascii="Calibri" w:hAnsi="Calibri"/>
+                <w:b/>
+                <w:color w:val="0B2545"/>
+                <w:sz w:val="22"/>
+              </w:rPr>
+              <w:t xml:space="preserve">Cycle actuel : </w:t>
+            </w:r>
+            <w:r>
+              <w:rPr>
+                <w:rFonts w:ascii="Calibri" w:hAnsi="Calibri"/>
+                <w:color w:val="000000"/>
+                <w:sz w:val="22"/>
+              </w:rPr>
+              <w:t>Le PAS suit le cycle actif, clôturé, puis archivé. Les anciennes commandes génériques Soumettre, Approuver, Verrouiller et Réouvrir ne font plus partie du parcours Web.</w:t>
+            </w:r>
+          </w:p>
+        </w:tc>
+      </w:tr>
+    </w:tbl>
+    <w:p/>
     <w:p>
       <w:pPr>
         <w:pStyle w:val="Heading1"/>
@@ -3880,6 +4027,55 @@
         <w:t>Les objectifs opérationnels validés sont transmis aux chefs de service concernés.</w:t>
       </w:r>
     </w:p>
+    <w:tbl>
+      <w:tblPr>
+        <w:tblW w:type="dxa" w:w="9360"/>
+        <w:jc w:val="left"/>
+        <w:tblLayout w:type="fixed"/>
+        <w:tblLook w:firstColumn="1" w:firstRow="1" w:lastColumn="0" w:lastRow="0" w:noHBand="0" w:noVBand="1" w:val="04A0"/>
+        <w:tblInd w:w="120" w:type="dxa"/>
+      </w:tblPr>
+      <w:tblGrid>
+        <w:gridCol w:w="9360"/>
+      </w:tblGrid>
+      <w:tr>
+        <w:trPr>
+          <w:tblHeader w:val="true"/>
+        </w:trPr>
+        <w:tc>
+          <w:tcPr>
+            <w:tcW w:type="dxa" w:w="9360"/>
+            <w:shd w:fill="F4F6F9"/>
+            <w:tcMar>
+              <w:top w:w="120" w:type="dxa"/>
+              <w:start w:w="160" w:type="dxa"/>
+              <w:bottom w:w="120" w:type="dxa"/>
+              <w:end w:w="160" w:type="dxa"/>
+            </w:tcMar>
+          </w:tcPr>
+          <w:p>
+            <w:r>
+              <w:rPr>
+                <w:rFonts w:ascii="Calibri" w:hAnsi="Calibri"/>
+                <w:b/>
+                <w:color w:val="0B2545"/>
+                <w:sz w:val="22"/>
+              </w:rPr>
+              <w:t xml:space="preserve">Cycle actuel : </w:t>
+            </w:r>
+            <w:r>
+              <w:rPr>
+                <w:rFonts w:ascii="Calibri" w:hAnsi="Calibri"/>
+                <w:color w:val="000000"/>
+                <w:sz w:val="22"/>
+              </w:rPr>
+              <w:t>Le PAO complet est validé dans le parcours de création, puis peut être clôturé et archivé. Un PAO archivé ne peut plus être modifié directement.</w:t>
+            </w:r>
+          </w:p>
+        </w:tc>
+      </w:tr>
+    </w:tbl>
+    <w:p/>
     <w:tbl>
       <w:tblPr>
         <w:tblStyle w:val="TableGrid"/>
@@ -3894,6 +4090,9 @@
         <w:gridCol w:w="6760"/>
       </w:tblGrid>
       <w:tr>
+        <w:trPr>
+          <w:tblHeader w:val="true"/>
+        </w:trPr>
         <w:tc>
           <w:tcPr>
             <w:tcW w:type="dxa" w:w="2600"/>
@@ -4337,7 +4536,7 @@
         <w:drawing>
           <wp:inline xmlns:a="http://schemas.openxmlformats.org/drawingml/2006/main" xmlns:pic="http://schemas.openxmlformats.org/drawingml/2006/picture">
             <wp:extent cx="5760720" cy="3763670"/>
-            <wp:docPr id="5" name="Picture 5"/>
+            <wp:docPr id="5" name="Picture 5" descr="Illustration fonctionnelle e-Pilotage 5" title="Illustration 5"/>
             <wp:cNvGraphicFramePr>
               <a:graphicFrameLocks noChangeAspect="1"/>
             </wp:cNvGraphicFramePr>
@@ -4444,6 +4643,68 @@
         <w:pStyle w:val="Heading2"/>
       </w:pPr>
       <w:r>
+        <w:t>Cycle du PTA</w:t>
+      </w:r>
+    </w:p>
+    <w:p>
+      <w:pPr>
+        <w:pStyle w:val="ListNumber"/>
+        <w:spacing w:after="80"/>
+      </w:pPr>
+      <w:r>
+        <w:t>Le PTA débute en brouillon tant que des actions restent à paramétrer.</w:t>
+      </w:r>
+    </w:p>
+    <w:p>
+      <w:pPr>
+        <w:pStyle w:val="ListNumber"/>
+        <w:spacing w:after="80"/>
+      </w:pPr>
+      <w:r>
+        <w:t>Lorsque les actions sont complètes, le PTA passe en cours.</w:t>
+      </w:r>
+    </w:p>
+    <w:p>
+      <w:pPr>
+        <w:pStyle w:val="ListNumber"/>
+        <w:spacing w:after="80"/>
+      </w:pPr>
+      <w:r>
+        <w:t>La première commande de clôture transmet le PTA au contrôle SCIQ.</w:t>
+      </w:r>
+    </w:p>
+    <w:p>
+      <w:pPr>
+        <w:pStyle w:val="ListNumber"/>
+        <w:spacing w:after="80"/>
+      </w:pPr>
+      <w:r>
+        <w:t>Après contrôle, la clôture finale place le PTA à l'état clôturé.</w:t>
+      </w:r>
+    </w:p>
+    <w:p>
+      <w:pPr>
+        <w:pStyle w:val="ListNumber"/>
+        <w:spacing w:after="80"/>
+      </w:pPr>
+      <w:r>
+        <w:t>L'archivage n'est possible qu'après clôture.</w:t>
+      </w:r>
+    </w:p>
+    <w:p>
+      <w:pPr>
+        <w:pStyle w:val="ListNumber"/>
+        <w:spacing w:after="80"/>
+      </w:pPr>
+      <w:r>
+        <w:t>Une correction exceptionnelle d'un PTA protégé exige une demande de déverrouillage motivée.</w:t>
+      </w:r>
+    </w:p>
+    <w:p>
+      <w:pPr>
+        <w:pStyle w:val="Heading2"/>
+      </w:pPr>
+      <w:r>
         <w:t>Créer une action dans le PTA</w:t>
       </w:r>
     </w:p>
@@ -4543,6 +4804,9 @@
         <w:gridCol w:w="2960"/>
       </w:tblGrid>
       <w:tr>
+        <w:trPr>
+          <w:tblHeader w:val="true"/>
+        </w:trPr>
         <w:tc>
           <w:tcPr>
             <w:tcW w:type="dxa" w:w="2100"/>
@@ -4870,6 +5134,9 @@
         <w:gridCol w:w="9360"/>
       </w:tblGrid>
       <w:tr>
+        <w:trPr>
+          <w:tblHeader w:val="true"/>
+        </w:trPr>
         <w:tc>
           <w:tcPr>
             <w:tcW w:type="dxa" w:w="9360"/>
@@ -4920,7 +5187,7 @@
         <w:drawing>
           <wp:inline xmlns:a="http://schemas.openxmlformats.org/drawingml/2006/main" xmlns:pic="http://schemas.openxmlformats.org/drawingml/2006/picture">
             <wp:extent cx="5760720" cy="3320886"/>
-            <wp:docPr id="6" name="Picture 6"/>
+            <wp:docPr id="6" name="Picture 6" descr="Illustration fonctionnelle e-Pilotage 6" title="Illustration 6"/>
             <wp:cNvGraphicFramePr>
               <a:graphicFrameLocks noChangeAspect="1"/>
             </wp:cNvGraphicFramePr>
@@ -5001,9 +5268,658 @@
         <w:spacing w:after="80"/>
       </w:pPr>
       <w:r>
-        <w:t>Consulter la fiche, la progression, les justificatifs, la discussion et le journal.</w:t>
+        <w:t>Utiliser les onglets Validation, Fiche, Échéances, Financement, Discussion, Justificatifs et Journal.</w:t>
       </w:r>
     </w:p>
+    <w:p>
+      <w:pPr>
+        <w:pStyle w:val="Heading2"/>
+      </w:pPr>
+      <w:r>
+        <w:t>Comprendre les onglets du suivi</w:t>
+      </w:r>
+    </w:p>
+    <w:tbl>
+      <w:tblPr>
+        <w:tblStyle w:val="TableGrid"/>
+        <w:tblW w:type="dxa" w:w="9360"/>
+        <w:jc w:val="left"/>
+        <w:tblLayout w:type="fixed"/>
+        <w:tblLook w:firstColumn="1" w:firstRow="1" w:lastColumn="0" w:lastRow="0" w:noHBand="0" w:noVBand="1" w:val="04A0"/>
+        <w:tblInd w:w="120" w:type="dxa"/>
+      </w:tblPr>
+      <w:tblGrid>
+        <w:gridCol w:w="1700"/>
+        <w:gridCol w:w="4750"/>
+        <w:gridCol w:w="2910"/>
+      </w:tblGrid>
+      <w:tr>
+        <w:trPr>
+          <w:tblHeader w:val="true"/>
+        </w:trPr>
+        <w:tc>
+          <w:tcPr>
+            <w:tcW w:type="dxa" w:w="1700"/>
+            <w:shd w:fill="E8EEF5"/>
+            <w:tcMar>
+              <w:top w:w="80" w:type="dxa"/>
+              <w:start w:w="120" w:type="dxa"/>
+              <w:bottom w:w="80" w:type="dxa"/>
+              <w:end w:w="120" w:type="dxa"/>
+            </w:tcMar>
+            <w:vAlign w:val="center"/>
+          </w:tcPr>
+          <w:p>
+            <w:pPr>
+              <w:jc w:val="center"/>
+            </w:pPr>
+            <w:r>
+              <w:rPr>
+                <w:rFonts w:ascii="Calibri" w:hAnsi="Calibri"/>
+                <w:b/>
+                <w:color w:val="0B2545"/>
+                <w:sz w:val="20"/>
+              </w:rPr>
+              <w:t>Onglet</w:t>
+            </w:r>
+          </w:p>
+        </w:tc>
+        <w:tc>
+          <w:tcPr>
+            <w:tcW w:type="dxa" w:w="4750"/>
+            <w:shd w:fill="E8EEF5"/>
+            <w:tcMar>
+              <w:top w:w="80" w:type="dxa"/>
+              <w:start w:w="120" w:type="dxa"/>
+              <w:bottom w:w="80" w:type="dxa"/>
+              <w:end w:w="120" w:type="dxa"/>
+            </w:tcMar>
+            <w:vAlign w:val="center"/>
+          </w:tcPr>
+          <w:p>
+            <w:pPr>
+              <w:jc w:val="center"/>
+            </w:pPr>
+            <w:r>
+              <w:rPr>
+                <w:rFonts w:ascii="Calibri" w:hAnsi="Calibri"/>
+                <w:b/>
+                <w:color w:val="0B2545"/>
+                <w:sz w:val="20"/>
+              </w:rPr>
+              <w:t>Contenu</w:t>
+            </w:r>
+          </w:p>
+        </w:tc>
+        <w:tc>
+          <w:tcPr>
+            <w:tcW w:type="dxa" w:w="2910"/>
+            <w:shd w:fill="E8EEF5"/>
+            <w:tcMar>
+              <w:top w:w="80" w:type="dxa"/>
+              <w:start w:w="120" w:type="dxa"/>
+              <w:bottom w:w="80" w:type="dxa"/>
+              <w:end w:w="120" w:type="dxa"/>
+            </w:tcMar>
+            <w:vAlign w:val="center"/>
+          </w:tcPr>
+          <w:p>
+            <w:pPr>
+              <w:jc w:val="center"/>
+            </w:pPr>
+            <w:r>
+              <w:rPr>
+                <w:rFonts w:ascii="Calibri" w:hAnsi="Calibri"/>
+                <w:b/>
+                <w:color w:val="0B2545"/>
+                <w:sz w:val="20"/>
+              </w:rPr>
+              <w:t>Utilisateur principalement concerné</w:t>
+            </w:r>
+          </w:p>
+        </w:tc>
+      </w:tr>
+      <w:tr>
+        <w:tc>
+          <w:tcPr>
+            <w:tcW w:type="dxa" w:w="1700"/>
+            <w:tcMar>
+              <w:top w:w="80" w:type="dxa"/>
+              <w:start w:w="120" w:type="dxa"/>
+              <w:bottom w:w="80" w:type="dxa"/>
+              <w:end w:w="120" w:type="dxa"/>
+            </w:tcMar>
+            <w:vAlign w:val="center"/>
+          </w:tcPr>
+          <w:p>
+            <w:pPr>
+              <w:spacing w:after="0"/>
+            </w:pPr>
+            <w:r>
+              <w:rPr>
+                <w:rFonts w:ascii="Calibri" w:hAnsi="Calibri"/>
+                <w:color w:val="000000"/>
+                <w:sz w:val="18"/>
+              </w:rPr>
+              <w:t>Validation</w:t>
+            </w:r>
+          </w:p>
+        </w:tc>
+        <w:tc>
+          <w:tcPr>
+            <w:tcW w:type="dxa" w:w="4750"/>
+            <w:tcMar>
+              <w:top w:w="80" w:type="dxa"/>
+              <w:start w:w="120" w:type="dxa"/>
+              <w:bottom w:w="80" w:type="dxa"/>
+              <w:end w:w="120" w:type="dxa"/>
+            </w:tcMar>
+            <w:vAlign w:val="center"/>
+          </w:tcPr>
+          <w:p>
+            <w:pPr>
+              <w:spacing w:after="0"/>
+            </w:pPr>
+            <w:r>
+              <w:rPr>
+                <w:rFonts w:ascii="Calibri" w:hAnsi="Calibri"/>
+                <w:color w:val="000000"/>
+                <w:sz w:val="18"/>
+              </w:rPr>
+              <w:t>Saisie d'avancement, soumission, visa du chef et contrôle final.</w:t>
+            </w:r>
+          </w:p>
+        </w:tc>
+        <w:tc>
+          <w:tcPr>
+            <w:tcW w:type="dxa" w:w="2910"/>
+            <w:tcMar>
+              <w:top w:w="80" w:type="dxa"/>
+              <w:start w:w="120" w:type="dxa"/>
+              <w:bottom w:w="80" w:type="dxa"/>
+              <w:end w:w="120" w:type="dxa"/>
+            </w:tcMar>
+            <w:vAlign w:val="center"/>
+          </w:tcPr>
+          <w:p>
+            <w:pPr>
+              <w:spacing w:after="0"/>
+            </w:pPr>
+            <w:r>
+              <w:rPr>
+                <w:rFonts w:ascii="Calibri" w:hAnsi="Calibri"/>
+                <w:color w:val="000000"/>
+                <w:sz w:val="18"/>
+              </w:rPr>
+              <w:t>Agent/RMO, chef de service, Planification/SCIQ</w:t>
+            </w:r>
+          </w:p>
+        </w:tc>
+      </w:tr>
+      <w:tr>
+        <w:tc>
+          <w:tcPr>
+            <w:tcW w:type="dxa" w:w="1700"/>
+            <w:tcMar>
+              <w:top w:w="80" w:type="dxa"/>
+              <w:start w:w="120" w:type="dxa"/>
+              <w:bottom w:w="80" w:type="dxa"/>
+              <w:end w:w="120" w:type="dxa"/>
+            </w:tcMar>
+            <w:vAlign w:val="center"/>
+          </w:tcPr>
+          <w:p>
+            <w:pPr>
+              <w:spacing w:after="0"/>
+            </w:pPr>
+            <w:r>
+              <w:rPr>
+                <w:rFonts w:ascii="Calibri" w:hAnsi="Calibri"/>
+                <w:color w:val="000000"/>
+                <w:sz w:val="18"/>
+              </w:rPr>
+              <w:t>Fiche</w:t>
+            </w:r>
+          </w:p>
+        </w:tc>
+        <w:tc>
+          <w:tcPr>
+            <w:tcW w:type="dxa" w:w="4750"/>
+            <w:tcMar>
+              <w:top w:w="80" w:type="dxa"/>
+              <w:start w:w="120" w:type="dxa"/>
+              <w:bottom w:w="80" w:type="dxa"/>
+              <w:end w:w="120" w:type="dxa"/>
+            </w:tcMar>
+            <w:vAlign w:val="center"/>
+          </w:tcPr>
+          <w:p>
+            <w:pPr>
+              <w:spacing w:after="0"/>
+            </w:pPr>
+            <w:r>
+              <w:rPr>
+                <w:rFonts w:ascii="Calibri" w:hAnsi="Calibri"/>
+                <w:color w:val="000000"/>
+                <w:sz w:val="18"/>
+              </w:rPr>
+              <w:t>Rattachement PAS-PAO-PTA, responsables, dates, cible, risques et paramètres.</w:t>
+            </w:r>
+          </w:p>
+        </w:tc>
+        <w:tc>
+          <w:tcPr>
+            <w:tcW w:type="dxa" w:w="2910"/>
+            <w:tcMar>
+              <w:top w:w="80" w:type="dxa"/>
+              <w:start w:w="120" w:type="dxa"/>
+              <w:bottom w:w="80" w:type="dxa"/>
+              <w:end w:w="120" w:type="dxa"/>
+            </w:tcMar>
+            <w:vAlign w:val="center"/>
+          </w:tcPr>
+          <w:p>
+            <w:pPr>
+              <w:spacing w:after="0"/>
+            </w:pPr>
+            <w:r>
+              <w:rPr>
+                <w:rFonts w:ascii="Calibri" w:hAnsi="Calibri"/>
+                <w:color w:val="000000"/>
+                <w:sz w:val="18"/>
+              </w:rPr>
+              <w:t>Tous les profils autorisés</w:t>
+            </w:r>
+          </w:p>
+        </w:tc>
+      </w:tr>
+      <w:tr>
+        <w:tc>
+          <w:tcPr>
+            <w:tcW w:type="dxa" w:w="1700"/>
+            <w:tcMar>
+              <w:top w:w="80" w:type="dxa"/>
+              <w:start w:w="120" w:type="dxa"/>
+              <w:bottom w:w="80" w:type="dxa"/>
+              <w:end w:w="120" w:type="dxa"/>
+            </w:tcMar>
+            <w:vAlign w:val="center"/>
+          </w:tcPr>
+          <w:p>
+            <w:pPr>
+              <w:spacing w:after="0"/>
+            </w:pPr>
+            <w:r>
+              <w:rPr>
+                <w:rFonts w:ascii="Calibri" w:hAnsi="Calibri"/>
+                <w:color w:val="000000"/>
+                <w:sz w:val="18"/>
+              </w:rPr>
+              <w:t>Échéances</w:t>
+            </w:r>
+          </w:p>
+        </w:tc>
+        <w:tc>
+          <w:tcPr>
+            <w:tcW w:type="dxa" w:w="4750"/>
+            <w:tcMar>
+              <w:top w:w="80" w:type="dxa"/>
+              <w:start w:w="120" w:type="dxa"/>
+              <w:bottom w:w="80" w:type="dxa"/>
+              <w:end w:w="120" w:type="dxa"/>
+            </w:tcMar>
+            <w:vAlign w:val="center"/>
+          </w:tcPr>
+          <w:p>
+            <w:pPr>
+              <w:spacing w:after="0"/>
+            </w:pPr>
+            <w:r>
+              <w:rPr>
+                <w:rFonts w:ascii="Calibri" w:hAnsi="Calibri"/>
+                <w:color w:val="000000"/>
+                <w:sz w:val="18"/>
+              </w:rPr>
+              <w:t>Demande de report, pièce justificative, avis et application de la date approuvée.</w:t>
+            </w:r>
+          </w:p>
+        </w:tc>
+        <w:tc>
+          <w:tcPr>
+            <w:tcW w:type="dxa" w:w="2910"/>
+            <w:tcMar>
+              <w:top w:w="80" w:type="dxa"/>
+              <w:start w:w="120" w:type="dxa"/>
+              <w:bottom w:w="80" w:type="dxa"/>
+              <w:end w:w="120" w:type="dxa"/>
+            </w:tcMar>
+            <w:vAlign w:val="center"/>
+          </w:tcPr>
+          <w:p>
+            <w:pPr>
+              <w:spacing w:after="0"/>
+            </w:pPr>
+            <w:r>
+              <w:rPr>
+                <w:rFonts w:ascii="Calibri" w:hAnsi="Calibri"/>
+                <w:color w:val="000000"/>
+                <w:sz w:val="18"/>
+              </w:rPr>
+              <w:t>RMO, chef, contrôleurs, décideur final</w:t>
+            </w:r>
+          </w:p>
+        </w:tc>
+      </w:tr>
+      <w:tr>
+        <w:tc>
+          <w:tcPr>
+            <w:tcW w:type="dxa" w:w="1700"/>
+            <w:tcMar>
+              <w:top w:w="80" w:type="dxa"/>
+              <w:start w:w="120" w:type="dxa"/>
+              <w:bottom w:w="80" w:type="dxa"/>
+              <w:end w:w="120" w:type="dxa"/>
+            </w:tcMar>
+            <w:vAlign w:val="center"/>
+          </w:tcPr>
+          <w:p>
+            <w:pPr>
+              <w:spacing w:after="0"/>
+            </w:pPr>
+            <w:r>
+              <w:rPr>
+                <w:rFonts w:ascii="Calibri" w:hAnsi="Calibri"/>
+                <w:color w:val="000000"/>
+                <w:sz w:val="18"/>
+              </w:rPr>
+              <w:t>Financement</w:t>
+            </w:r>
+          </w:p>
+        </w:tc>
+        <w:tc>
+          <w:tcPr>
+            <w:tcW w:type="dxa" w:w="4750"/>
+            <w:tcMar>
+              <w:top w:w="80" w:type="dxa"/>
+              <w:start w:w="120" w:type="dxa"/>
+              <w:bottom w:w="80" w:type="dxa"/>
+              <w:end w:w="120" w:type="dxa"/>
+            </w:tcMar>
+            <w:vAlign w:val="center"/>
+          </w:tcPr>
+          <w:p>
+            <w:pPr>
+              <w:spacing w:after="0"/>
+            </w:pPr>
+            <w:r>
+              <w:rPr>
+                <w:rFonts w:ascii="Calibri" w:hAnsi="Calibri"/>
+                <w:color w:val="000000"/>
+                <w:sz w:val="18"/>
+              </w:rPr>
+              <w:t>Dossier RMO, instruction DAF, compléments et décision DG.</w:t>
+            </w:r>
+          </w:p>
+        </w:tc>
+        <w:tc>
+          <w:tcPr>
+            <w:tcW w:type="dxa" w:w="2910"/>
+            <w:tcMar>
+              <w:top w:w="80" w:type="dxa"/>
+              <w:start w:w="120" w:type="dxa"/>
+              <w:bottom w:w="80" w:type="dxa"/>
+              <w:end w:w="120" w:type="dxa"/>
+            </w:tcMar>
+            <w:vAlign w:val="center"/>
+          </w:tcPr>
+          <w:p>
+            <w:pPr>
+              <w:spacing w:after="0"/>
+            </w:pPr>
+            <w:r>
+              <w:rPr>
+                <w:rFonts w:ascii="Calibri" w:hAnsi="Calibri"/>
+                <w:color w:val="000000"/>
+                <w:sz w:val="18"/>
+              </w:rPr>
+              <w:t>RMO, DAF, DG</w:t>
+            </w:r>
+          </w:p>
+        </w:tc>
+      </w:tr>
+      <w:tr>
+        <w:tc>
+          <w:tcPr>
+            <w:tcW w:type="dxa" w:w="1700"/>
+            <w:tcMar>
+              <w:top w:w="80" w:type="dxa"/>
+              <w:start w:w="120" w:type="dxa"/>
+              <w:bottom w:w="80" w:type="dxa"/>
+              <w:end w:w="120" w:type="dxa"/>
+            </w:tcMar>
+            <w:vAlign w:val="center"/>
+          </w:tcPr>
+          <w:p>
+            <w:pPr>
+              <w:spacing w:after="0"/>
+            </w:pPr>
+            <w:r>
+              <w:rPr>
+                <w:rFonts w:ascii="Calibri" w:hAnsi="Calibri"/>
+                <w:color w:val="000000"/>
+                <w:sz w:val="18"/>
+              </w:rPr>
+              <w:t>Discussion</w:t>
+            </w:r>
+          </w:p>
+        </w:tc>
+        <w:tc>
+          <w:tcPr>
+            <w:tcW w:type="dxa" w:w="4750"/>
+            <w:tcMar>
+              <w:top w:w="80" w:type="dxa"/>
+              <w:start w:w="120" w:type="dxa"/>
+              <w:bottom w:w="80" w:type="dxa"/>
+              <w:end w:w="120" w:type="dxa"/>
+            </w:tcMar>
+            <w:vAlign w:val="center"/>
+          </w:tcPr>
+          <w:p>
+            <w:pPr>
+              <w:spacing w:after="0"/>
+            </w:pPr>
+            <w:r>
+              <w:rPr>
+                <w:rFonts w:ascii="Calibri" w:hAnsi="Calibri"/>
+                <w:color w:val="000000"/>
+                <w:sz w:val="18"/>
+              </w:rPr>
+              <w:t>Commentaires et retours de validation horodatés.</w:t>
+            </w:r>
+          </w:p>
+        </w:tc>
+        <w:tc>
+          <w:tcPr>
+            <w:tcW w:type="dxa" w:w="2910"/>
+            <w:tcMar>
+              <w:top w:w="80" w:type="dxa"/>
+              <w:start w:w="120" w:type="dxa"/>
+              <w:bottom w:w="80" w:type="dxa"/>
+              <w:end w:w="120" w:type="dxa"/>
+            </w:tcMar>
+            <w:vAlign w:val="center"/>
+          </w:tcPr>
+          <w:p>
+            <w:pPr>
+              <w:spacing w:after="0"/>
+            </w:pPr>
+            <w:r>
+              <w:rPr>
+                <w:rFonts w:ascii="Calibri" w:hAnsi="Calibri"/>
+                <w:color w:val="000000"/>
+                <w:sz w:val="18"/>
+              </w:rPr>
+              <w:t>Acteurs du dossier</w:t>
+            </w:r>
+          </w:p>
+        </w:tc>
+      </w:tr>
+      <w:tr>
+        <w:tc>
+          <w:tcPr>
+            <w:tcW w:type="dxa" w:w="1700"/>
+            <w:tcMar>
+              <w:top w:w="80" w:type="dxa"/>
+              <w:start w:w="120" w:type="dxa"/>
+              <w:bottom w:w="80" w:type="dxa"/>
+              <w:end w:w="120" w:type="dxa"/>
+            </w:tcMar>
+            <w:vAlign w:val="center"/>
+          </w:tcPr>
+          <w:p>
+            <w:pPr>
+              <w:spacing w:after="0"/>
+            </w:pPr>
+            <w:r>
+              <w:rPr>
+                <w:rFonts w:ascii="Calibri" w:hAnsi="Calibri"/>
+                <w:color w:val="000000"/>
+                <w:sz w:val="18"/>
+              </w:rPr>
+              <w:t>Justificatifs</w:t>
+            </w:r>
+          </w:p>
+        </w:tc>
+        <w:tc>
+          <w:tcPr>
+            <w:tcW w:type="dxa" w:w="4750"/>
+            <w:tcMar>
+              <w:top w:w="80" w:type="dxa"/>
+              <w:start w:w="120" w:type="dxa"/>
+              <w:bottom w:w="80" w:type="dxa"/>
+              <w:end w:w="120" w:type="dxa"/>
+            </w:tcMar>
+            <w:vAlign w:val="center"/>
+          </w:tcPr>
+          <w:p>
+            <w:pPr>
+              <w:spacing w:after="0"/>
+            </w:pPr>
+            <w:r>
+              <w:rPr>
+                <w:rFonts w:ascii="Calibri" w:hAnsi="Calibri"/>
+                <w:color w:val="000000"/>
+                <w:sz w:val="18"/>
+              </w:rPr>
+              <w:t>Pièces d'exécution, de correction et de clôture.</w:t>
+            </w:r>
+          </w:p>
+        </w:tc>
+        <w:tc>
+          <w:tcPr>
+            <w:tcW w:type="dxa" w:w="2910"/>
+            <w:tcMar>
+              <w:top w:w="80" w:type="dxa"/>
+              <w:start w:w="120" w:type="dxa"/>
+              <w:bottom w:w="80" w:type="dxa"/>
+              <w:end w:w="120" w:type="dxa"/>
+            </w:tcMar>
+            <w:vAlign w:val="center"/>
+          </w:tcPr>
+          <w:p>
+            <w:pPr>
+              <w:spacing w:after="0"/>
+            </w:pPr>
+            <w:r>
+              <w:rPr>
+                <w:rFonts w:ascii="Calibri" w:hAnsi="Calibri"/>
+                <w:color w:val="000000"/>
+                <w:sz w:val="18"/>
+              </w:rPr>
+              <w:t>RMO et validateurs</w:t>
+            </w:r>
+          </w:p>
+        </w:tc>
+      </w:tr>
+      <w:tr>
+        <w:tc>
+          <w:tcPr>
+            <w:tcW w:type="dxa" w:w="1700"/>
+            <w:tcMar>
+              <w:top w:w="80" w:type="dxa"/>
+              <w:start w:w="120" w:type="dxa"/>
+              <w:bottom w:w="80" w:type="dxa"/>
+              <w:end w:w="120" w:type="dxa"/>
+            </w:tcMar>
+            <w:vAlign w:val="center"/>
+          </w:tcPr>
+          <w:p>
+            <w:pPr>
+              <w:spacing w:after="0"/>
+            </w:pPr>
+            <w:r>
+              <w:rPr>
+                <w:rFonts w:ascii="Calibri" w:hAnsi="Calibri"/>
+                <w:color w:val="000000"/>
+                <w:sz w:val="18"/>
+              </w:rPr>
+              <w:t>Journal</w:t>
+            </w:r>
+          </w:p>
+        </w:tc>
+        <w:tc>
+          <w:tcPr>
+            <w:tcW w:type="dxa" w:w="4750"/>
+            <w:tcMar>
+              <w:top w:w="80" w:type="dxa"/>
+              <w:start w:w="120" w:type="dxa"/>
+              <w:bottom w:w="80" w:type="dxa"/>
+              <w:end w:w="120" w:type="dxa"/>
+            </w:tcMar>
+            <w:vAlign w:val="center"/>
+          </w:tcPr>
+          <w:p>
+            <w:pPr>
+              <w:spacing w:after="0"/>
+            </w:pPr>
+            <w:r>
+              <w:rPr>
+                <w:rFonts w:ascii="Calibri" w:hAnsi="Calibri"/>
+                <w:color w:val="000000"/>
+                <w:sz w:val="18"/>
+              </w:rPr>
+              <w:t>Historique des événements, décisions et alertes de l'action.</w:t>
+            </w:r>
+          </w:p>
+        </w:tc>
+        <w:tc>
+          <w:tcPr>
+            <w:tcW w:type="dxa" w:w="2910"/>
+            <w:tcMar>
+              <w:top w:w="80" w:type="dxa"/>
+              <w:start w:w="120" w:type="dxa"/>
+              <w:bottom w:w="80" w:type="dxa"/>
+              <w:end w:w="120" w:type="dxa"/>
+            </w:tcMar>
+            <w:vAlign w:val="center"/>
+          </w:tcPr>
+          <w:p>
+            <w:pPr>
+              <w:spacing w:after="0"/>
+            </w:pPr>
+            <w:r>
+              <w:rPr>
+                <w:rFonts w:ascii="Calibri" w:hAnsi="Calibri"/>
+                <w:color w:val="000000"/>
+                <w:sz w:val="18"/>
+              </w:rPr>
+              <w:t>Contrôleurs et profils habilités</w:t>
+            </w:r>
+          </w:p>
+        </w:tc>
+      </w:tr>
+    </w:tbl>
+    <w:p/>
     <w:p>
       <w:pPr>
         <w:pStyle w:val="Heading2"/>
@@ -5071,7 +5987,7 @@
         <w:pStyle w:val="Heading2"/>
       </w:pPr>
       <w:r>
-        <w:t>Soumettre au chef</w:t>
+        <w:t>Soumettre l'avancement</w:t>
       </w:r>
     </w:p>
     <w:p>
@@ -5125,7 +6041,7 @@
         <w:spacing w:after="80"/>
       </w:pPr>
       <w:r>
-        <w:t>Attendre la validation ou la demande de correction.</w:t>
+        <w:t>Attendre le visa du chef de service puis le contrôle Planification/SCIQ.</w:t>
       </w:r>
     </w:p>
     <w:tbl>
@@ -5140,6 +6056,9 @@
         <w:gridCol w:w="9360"/>
       </w:tblGrid>
       <w:tr>
+        <w:trPr>
+          <w:tblHeader w:val="true"/>
+        </w:trPr>
         <w:tc>
           <w:tcPr>
             <w:tcW w:type="dxa" w:w="9360"/>
@@ -5167,7 +6086,7 @@
                 <w:color w:val="000000"/>
                 <w:sz w:val="22"/>
               </w:rPr>
-              <w:t>Enregistrer calcule une performance provisoire. Soumettre déclenche le contrôle. Valider par le chef fige la performance officielle.</w:t>
+              <w:t>Enregistrer conserve un brouillon. Soumettre déclenche le visa hiérarchique. La performance devient officielle seulement après le contrôle final requis.</w:t>
             </w:r>
           </w:p>
         </w:tc>
@@ -5187,7 +6106,7 @@
         <w:pStyle w:val="Heading2"/>
       </w:pPr>
       <w:r>
-        <w:t>Validation chef</w:t>
+        <w:t>Visa du chef et contrôle final</w:t>
       </w:r>
     </w:p>
     <w:p>
@@ -5214,7 +6133,7 @@
         <w:spacing w:after="80"/>
       </w:pPr>
       <w:r>
-        <w:t>S'il valide, l'action ou la sous-action devient officiellement prise en compte.</w:t>
+        <w:t>S'il valide, le dossier est transmis au contrôleur Planification/SCIQ.</w:t>
       </w:r>
     </w:p>
     <w:p>
@@ -5223,7 +6142,25 @@
         <w:spacing w:after="80"/>
       </w:pPr>
       <w:r>
-        <w:t>S'il rejette, il doit renseigner un motif. L'élément revient en correction.</w:t>
+        <w:t>Le contrôleur vérifie la conformité, la preuve et la cohérence du résultat.</w:t>
+      </w:r>
+    </w:p>
+    <w:p>
+      <w:pPr>
+        <w:pStyle w:val="ListBullet"/>
+        <w:spacing w:after="80"/>
+      </w:pPr>
+      <w:r>
+        <w:t>Tout rejet ou retour doit être motivé ; l'élément revient alors au RMO pour correction.</w:t>
+      </w:r>
+    </w:p>
+    <w:p>
+      <w:pPr>
+        <w:pStyle w:val="ListBullet"/>
+        <w:spacing w:after="80"/>
+      </w:pPr>
+      <w:r>
+        <w:t>La clôture n'est acquise qu'après la dernière validation prévue par le workflow.</w:t>
       </w:r>
     </w:p>
     <w:p>
@@ -5284,45 +6221,130 @@
         <w:pStyle w:val="Heading2"/>
       </w:pPr>
       <w:r>
-        <w:t>Demande de modification</w:t>
+        <w:t>Demander un report d'échéance</w:t>
       </w:r>
     </w:p>
     <w:p>
       <w:pPr>
-        <w:pStyle w:val="ListBullet"/>
+        <w:pStyle w:val="ListNumber"/>
         <w:spacing w:after="80"/>
       </w:pPr>
       <w:r>
-        <w:t>Après enregistrement définitif, certaines actions peuvent être figées en lecture seule.</w:t>
+        <w:t>Ouvrir l'action puis l'onglet Échéances, ou cliquer sur Report de l'action.</w:t>
       </w:r>
     </w:p>
     <w:p>
       <w:pPr>
-        <w:pStyle w:val="ListBullet"/>
+        <w:pStyle w:val="ListNumber"/>
         <w:spacing w:after="80"/>
       </w:pPr>
       <w:r>
-        <w:t>Le bouton Demande de modification permet de demander la réouverture.</w:t>
+        <w:t>Sélectionner l'action ou la sous-action concernée.</w:t>
       </w:r>
     </w:p>
     <w:p>
       <w:pPr>
-        <w:pStyle w:val="ListBullet"/>
+        <w:pStyle w:val="ListNumber"/>
         <w:spacing w:after="80"/>
       </w:pPr>
       <w:r>
-        <w:t>La demande suit le circuit contrôleur SCIQ/Planification puis décision DG selon la configuration.</w:t>
+        <w:t>Saisir la nouvelle date souhaitée, le motif et la justification détaillée.</w:t>
       </w:r>
     </w:p>
     <w:p>
       <w:pPr>
-        <w:pStyle w:val="ListBullet"/>
+        <w:pStyle w:val="ListNumber"/>
         <w:spacing w:after="80"/>
       </w:pPr>
       <w:r>
-        <w:t>Le motif doit être clair : erreur de saisie, changement d'échéance, réaffectation, ajustement de cible ou correction de financement.</w:t>
+        <w:t>Joindre obligatoirement une pièce justificative lisible.</w:t>
       </w:r>
     </w:p>
+    <w:p>
+      <w:pPr>
+        <w:pStyle w:val="ListNumber"/>
+        <w:spacing w:after="80"/>
+      </w:pPr>
+      <w:r>
+        <w:t>Soumettre la demande au chef de service.</w:t>
+      </w:r>
+    </w:p>
+    <w:p>
+      <w:pPr>
+        <w:pStyle w:val="ListNumber"/>
+        <w:spacing w:after="80"/>
+      </w:pPr>
+      <w:r>
+        <w:t>Après l'avis du chef, attendre le contrôle Planification/SCIQ.</w:t>
+      </w:r>
+    </w:p>
+    <w:p>
+      <w:pPr>
+        <w:pStyle w:val="ListNumber"/>
+        <w:spacing w:after="80"/>
+      </w:pPr>
+      <w:r>
+        <w:t>La DG ou le Chef Planification rend la décision finale selon le circuit applicable.</w:t>
+      </w:r>
+    </w:p>
+    <w:p>
+      <w:pPr>
+        <w:pStyle w:val="ListNumber"/>
+        <w:spacing w:after="80"/>
+      </w:pPr>
+      <w:r>
+        <w:t>Après approbation finale, seul un contrôleur habilité applique la nouvelle date.</w:t>
+      </w:r>
+    </w:p>
+    <w:tbl>
+      <w:tblPr>
+        <w:tblW w:type="dxa" w:w="9360"/>
+        <w:jc w:val="left"/>
+        <w:tblLayout w:type="fixed"/>
+        <w:tblLook w:firstColumn="1" w:firstRow="1" w:lastColumn="0" w:lastRow="0" w:noHBand="0" w:noVBand="1" w:val="04A0"/>
+        <w:tblInd w:w="120" w:type="dxa"/>
+      </w:tblPr>
+      <w:tblGrid>
+        <w:gridCol w:w="9360"/>
+      </w:tblGrid>
+      <w:tr>
+        <w:trPr>
+          <w:tblHeader w:val="true"/>
+        </w:trPr>
+        <w:tc>
+          <w:tcPr>
+            <w:tcW w:type="dxa" w:w="9360"/>
+            <w:shd w:fill="FFF4D6"/>
+            <w:tcMar>
+              <w:top w:w="120" w:type="dxa"/>
+              <w:start w:w="160" w:type="dxa"/>
+              <w:bottom w:w="120" w:type="dxa"/>
+              <w:end w:w="160" w:type="dxa"/>
+            </w:tcMar>
+          </w:tcPr>
+          <w:p>
+            <w:r>
+              <w:rPr>
+                <w:rFonts w:ascii="Calibri" w:hAnsi="Calibri"/>
+                <w:b/>
+                <w:color w:val="0B2545"/>
+                <w:sz w:val="22"/>
+              </w:rPr>
+              <w:t xml:space="preserve">Règle impérative : </w:t>
+            </w:r>
+            <w:r>
+              <w:rPr>
+                <w:rFonts w:ascii="Calibri" w:hAnsi="Calibri"/>
+                <w:color w:val="000000"/>
+                <w:sz w:val="22"/>
+              </w:rPr>
+              <w:t>Aucune date d'action ou de sous-action ne peut être changée directement, même par un contrôleur. Le changement n'est appliqué qu'après l'approbation complète de la demande de report.</w:t>
+            </w:r>
+          </w:p>
+        </w:tc>
+      </w:tr>
+    </w:tbl>
+    <w:p/>
     <w:p>
       <w:pPr>
         <w:pStyle w:val="Heading2"/>
@@ -5333,38 +6355,56 @@
     </w:p>
     <w:p>
       <w:pPr>
-        <w:pStyle w:val="ListBullet"/>
+        <w:pStyle w:val="ListNumber"/>
         <w:spacing w:after="80"/>
       </w:pPr>
       <w:r>
-        <w:t>Si l'action nécessite un financement, le PTA doit indiquer le besoin, le montant, la nature et la pièce justificative.</w:t>
+        <w:t>Le RMO prépare le dossier dans l'onglet Financement : source, montant, commentaire et pièce justificative.</w:t>
       </w:r>
     </w:p>
     <w:p>
       <w:pPr>
-        <w:pStyle w:val="ListBullet"/>
+        <w:pStyle w:val="ListNumber"/>
         <w:spacing w:after="80"/>
       </w:pPr>
       <w:r>
-        <w:t>Le DAF peut valider et transmettre à la DG, demander un complément ou rejeter.</w:t>
+        <w:t>Le RMO soumet le dossier à la DAF.</w:t>
       </w:r>
     </w:p>
     <w:p>
       <w:pPr>
-        <w:pStyle w:val="ListBullet"/>
+        <w:pStyle w:val="ListNumber"/>
         <w:spacing w:after="80"/>
       </w:pPr>
       <w:r>
-        <w:t>La DG peut accorder ou refuser le financement.</w:t>
+        <w:t>La DAF donne un avis favorable, demande un complément ou rejette avec un motif.</w:t>
       </w:r>
     </w:p>
     <w:p>
       <w:pPr>
-        <w:pStyle w:val="ListBullet"/>
+        <w:pStyle w:val="ListNumber"/>
         <w:spacing w:after="80"/>
       </w:pPr>
       <w:r>
-        <w:t>Les décisions, dates, pièces et commentaires restent visibles dans le détail de l'action.</w:t>
+        <w:t>En cas de complément ou de rejet corrigeable, le RMO ajoute une nouvelle pièce et soumet à nouveau.</w:t>
+      </w:r>
+    </w:p>
+    <w:p>
+      <w:pPr>
+        <w:pStyle w:val="ListNumber"/>
+        <w:spacing w:after="80"/>
+      </w:pPr>
+      <w:r>
+        <w:t>Après avis favorable de la DAF, la DG accorde ou refuse le financement.</w:t>
+      </w:r>
+    </w:p>
+    <w:p>
+      <w:pPr>
+        <w:pStyle w:val="ListNumber"/>
+        <w:spacing w:after="80"/>
+      </w:pPr>
+      <w:r>
+        <w:t>Consulter l'historique des décisions, pièces et dates dans l'action.</w:t>
       </w:r>
     </w:p>
     <w:p>
@@ -5383,7 +6423,7 @@
         <w:drawing>
           <wp:inline xmlns:a="http://schemas.openxmlformats.org/drawingml/2006/main" xmlns:pic="http://schemas.openxmlformats.org/drawingml/2006/picture">
             <wp:extent cx="5760720" cy="2952369"/>
-            <wp:docPr id="7" name="Picture 7"/>
+            <wp:docPr id="7" name="Picture 7" descr="Illustration fonctionnelle e-Pilotage 7" title="Illustration 7"/>
             <wp:cNvGraphicFramePr>
               <a:graphicFrameLocks noChangeAspect="1"/>
             </wp:cNvGraphicFramePr>
@@ -5446,7 +6486,7 @@
         <w:spacing w:after="80"/>
       </w:pPr>
       <w:r>
-        <w:t>Choisir le type de rapport métier.</w:t>
+        <w:t>Choisir le parcours de reporting ou de rapport assisté proposé depuis l'entrée Reporting.</w:t>
       </w:r>
     </w:p>
     <w:p>
@@ -5525,6 +6565,77 @@
         <w:pStyle w:val="Heading2"/>
       </w:pPr>
       <w:r>
+        <w:t>Produire un rapport assisté par IA</w:t>
+      </w:r>
+    </w:p>
+    <w:p>
+      <w:pPr>
+        <w:pStyle w:val="ListNumber"/>
+        <w:spacing w:after="80"/>
+      </w:pPr>
+      <w:r>
+        <w:t>Ouvrir Pilotage &gt; Reporting puis l'onglet Rapport assisté par IA.</w:t>
+      </w:r>
+    </w:p>
+    <w:p>
+      <w:pPr>
+        <w:pStyle w:val="ListNumber"/>
+        <w:spacing w:after="80"/>
+      </w:pPr>
+      <w:r>
+        <w:t>Choisir le niveau PAS, PAO ou PTA et le périmètre autorisé.</w:t>
+      </w:r>
+    </w:p>
+    <w:p>
+      <w:pPr>
+        <w:pStyle w:val="ListNumber"/>
+        <w:spacing w:after="80"/>
+      </w:pPr>
+      <w:r>
+        <w:t>Lancer la génération du brouillon à partir des indicateurs calculés par l'application.</w:t>
+      </w:r>
+    </w:p>
+    <w:p>
+      <w:pPr>
+        <w:pStyle w:val="ListNumber"/>
+        <w:spacing w:after="80"/>
+      </w:pPr>
+      <w:r>
+        <w:t>Relire les chiffres, les analyses, les risques et les recommandations proposés.</w:t>
+      </w:r>
+    </w:p>
+    <w:p>
+      <w:pPr>
+        <w:pStyle w:val="ListNumber"/>
+        <w:spacing w:after="80"/>
+      </w:pPr>
+      <w:r>
+        <w:t>Corriger le texte lorsque cela est nécessaire.</w:t>
+      </w:r>
+    </w:p>
+    <w:p>
+      <w:pPr>
+        <w:pStyle w:val="ListNumber"/>
+        <w:spacing w:after="80"/>
+      </w:pPr>
+      <w:r>
+        <w:t>Faire valider humainement le rapport avant tout export officiel.</w:t>
+      </w:r>
+    </w:p>
+    <w:p>
+      <w:pPr>
+        <w:pStyle w:val="ListNumber"/>
+        <w:spacing w:after="80"/>
+      </w:pPr>
+      <w:r>
+        <w:t>Exporter le contenu validé en Word, PDF ou Excel selon les formats disponibles.</w:t>
+      </w:r>
+    </w:p>
+    <w:p>
+      <w:pPr>
+        <w:pStyle w:val="Heading2"/>
+      </w:pPr>
+      <w:r>
         <w:t>Gérer les alertes</w:t>
       </w:r>
     </w:p>
@@ -5566,6 +6677,59 @@
     </w:p>
     <w:p>
       <w:pPr>
+        <w:pStyle w:val="Heading2"/>
+      </w:pPr>
+      <w:r>
+        <w:t>Utiliser le centre Notifications</w:t>
+      </w:r>
+    </w:p>
+    <w:p>
+      <w:pPr>
+        <w:pStyle w:val="ListBullet"/>
+        <w:spacing w:after="80"/>
+      </w:pPr>
+      <w:r>
+        <w:t>La page Notifications regroupe les messages applicatifs et un accès aux alertes actives.</w:t>
+      </w:r>
+    </w:p>
+    <w:p>
+      <w:pPr>
+        <w:pStyle w:val="ListBullet"/>
+        <w:spacing w:after="80"/>
+      </w:pPr>
+      <w:r>
+        <w:t>Les compteurs de la barre latérale et de l'en-tête reflètent les éléments non lus du périmètre.</w:t>
+      </w:r>
+    </w:p>
+    <w:p>
+      <w:pPr>
+        <w:pStyle w:val="ListBullet"/>
+        <w:spacing w:after="80"/>
+      </w:pPr>
+      <w:r>
+        <w:t>Les notifications de validation, correction, financement et report ouvrent directement le dossier concerné.</w:t>
+      </w:r>
+    </w:p>
+    <w:p>
+      <w:pPr>
+        <w:pStyle w:val="ListBullet"/>
+        <w:spacing w:after="80"/>
+      </w:pPr>
+      <w:r>
+        <w:t>Utiliser Marquer comme lu après traitement ou Tout marquer comme lu pour nettoyer la file.</w:t>
+      </w:r>
+    </w:p>
+    <w:p>
+      <w:pPr>
+        <w:pStyle w:val="ListBullet"/>
+        <w:spacing w:after="80"/>
+      </w:pPr>
+      <w:r>
+        <w:t>Les canaux, seuils, délais d'escalade et digests sont configurés par les administrateurs habilités.</w:t>
+      </w:r>
+    </w:p>
+    <w:p>
+      <w:pPr>
         <w:pStyle w:val="Heading1"/>
       </w:pPr>
       <w:r>
@@ -5688,6 +6852,24 @@
     </w:p>
     <w:p>
       <w:pPr>
+        <w:pStyle w:val="ListBullet"/>
+        <w:spacing w:after="80"/>
+      </w:pPr>
+      <w:r>
+        <w:t>L'export CSV reprend les filtres autorisés sans exposer de secret.</w:t>
+      </w:r>
+    </w:p>
+    <w:p>
+      <w:pPr>
+        <w:pStyle w:val="ListBullet"/>
+        <w:spacing w:after="80"/>
+      </w:pPr>
+      <w:r>
+        <w:t>Le journal est en ajout uniquement : une entrée existante n'est pas modifiée pour réécrire l'histoire.</w:t>
+      </w:r>
+    </w:p>
+    <w:p>
+      <w:pPr>
         <w:pStyle w:val="Heading2"/>
       </w:pPr>
       <w:r>
@@ -5700,7 +6882,52 @@
         <w:spacing w:after="80"/>
       </w:pPr>
       <w:r>
-        <w:t>La rétention concerne l'archivage et les règles de conservation des données.</w:t>
+        <w:t>La rétention concerne l'archivage et les règles de conservation des données opérationnelles.</w:t>
+      </w:r>
+    </w:p>
+    <w:p>
+      <w:pPr>
+        <w:pStyle w:val="ListBullet"/>
+        <w:spacing w:after="80"/>
+      </w:pPr>
+      <w:r>
+        <w:t>Commencer par une simulation : elle affiche les candidats sans modifier les données.</w:t>
+      </w:r>
+    </w:p>
+    <w:p>
+      <w:pPr>
+        <w:pStyle w:val="ListBullet"/>
+        <w:spacing w:after="80"/>
+      </w:pPr>
+      <w:r>
+        <w:t>Une seule exécution peut travailler sur un même périmètre à la fois.</w:t>
+      </w:r>
+    </w:p>
+    <w:p>
+      <w:pPr>
+        <w:pStyle w:val="ListBullet"/>
+        <w:spacing w:after="80"/>
+      </w:pPr>
+      <w:r>
+        <w:t>Le registre conserve les simulations et exécutions Web, console ou planifiées.</w:t>
+      </w:r>
+    </w:p>
+    <w:p>
+      <w:pPr>
+        <w:pStyle w:val="ListBullet"/>
+        <w:spacing w:after="80"/>
+      </w:pPr>
+      <w:r>
+        <w:t>Les candidats peuvent être exportés et les archives téléchargées en JSON masqué selon les droits.</w:t>
+      </w:r>
+    </w:p>
+    <w:p>
+      <w:pPr>
+        <w:pStyle w:val="ListBullet"/>
+        <w:spacing w:after="80"/>
+      </w:pPr>
+      <w:r>
+        <w:t>Le journal d'audit n'est jamais supprimé par la rétention.</w:t>
       </w:r>
     </w:p>
     <w:p>
@@ -5737,7 +6964,7 @@
         <w:drawing>
           <wp:inline xmlns:a="http://schemas.openxmlformats.org/drawingml/2006/main" xmlns:pic="http://schemas.openxmlformats.org/drawingml/2006/picture">
             <wp:extent cx="5760720" cy="3240405"/>
-            <wp:docPr id="8" name="Picture 8"/>
+            <wp:docPr id="8" name="Picture 8" descr="Illustration fonctionnelle e-Pilotage 8" title="Illustration 8"/>
             <wp:cNvGraphicFramePr>
               <a:graphicFrameLocks noChangeAspect="1"/>
             </wp:cNvGraphicFramePr>
@@ -6001,6 +7228,9 @@
         <w:gridCol w:w="9360"/>
       </w:tblGrid>
       <w:tr>
+        <w:trPr>
+          <w:tblHeader w:val="true"/>
+        </w:trPr>
         <w:tc>
           <w:tcPr>
             <w:tcW w:type="dxa" w:w="9360"/>
@@ -6040,24 +7270,30 @@
         <w:pStyle w:val="Heading1"/>
       </w:pPr>
       <w:r>
-        <w:t>15. Imports Excel</w:t>
+        <w:t>15. Imports classiques et assistés par IA</w:t>
       </w:r>
     </w:p>
     <w:p>
-      <w:pPr>
-        <w:pStyle w:val="Heading2"/>
-      </w:pPr>
+      <w:pPr/>
       <w:r>
-        <w:t>Importer un fichier</w:t>
+        <w:t>La barre latérale présente une seule entrée Imports afin d'éviter les doublons. Cette entrée donne accès à deux parcours techniques distincts : l'import classique de fichiers structurés et l'import assisté par IA/OCR.</w:t>
       </w:r>
     </w:p>
     <w:p>
       <w:pPr>
+        <w:pStyle w:val="Heading2"/>
+      </w:pPr>
+      <w:r>
+        <w:t>Importer un fichier structuré</w:t>
+      </w:r>
+    </w:p>
+    <w:p>
+      <w:pPr>
         <w:pStyle w:val="ListNumber"/>
         <w:spacing w:after="80"/>
       </w:pPr>
       <w:r>
-        <w:t>Ouvrir Planification &gt; Imports Excel.</w:t>
+        <w:t>Ouvrir Planification &gt; Imports puis choisir le parcours d'import classique.</w:t>
       </w:r>
     </w:p>
     <w:p>
@@ -6176,6 +7412,126 @@
         <w:t>Lire le rapport d'erreurs si l'import échoue.</w:t>
       </w:r>
     </w:p>
+    <w:p>
+      <w:pPr>
+        <w:pStyle w:val="Heading2"/>
+      </w:pPr>
+      <w:r>
+        <w:t>Utiliser l'import assisté par IA</w:t>
+      </w:r>
+    </w:p>
+    <w:p>
+      <w:pPr>
+        <w:pStyle w:val="ListNumber"/>
+        <w:spacing w:after="80"/>
+      </w:pPr>
+      <w:r>
+        <w:t>Ouvrir Planification &gt; Imports puis accéder au parcours d'import assisté par IA.</w:t>
+      </w:r>
+    </w:p>
+    <w:p>
+      <w:pPr>
+        <w:pStyle w:val="ListNumber"/>
+        <w:spacing w:after="80"/>
+      </w:pPr>
+      <w:r>
+        <w:t>Déposer le document PTA autorisé : Excel, CSV, PDF, Word ou image selon la configuration.</w:t>
+      </w:r>
+    </w:p>
+    <w:p>
+      <w:pPr>
+        <w:pStyle w:val="ListNumber"/>
+        <w:spacing w:after="80"/>
+      </w:pPr>
+      <w:r>
+        <w:t>Attendre l'extraction et consulter les lignes reconnues, les avertissements et le score de confiance.</w:t>
+      </w:r>
+    </w:p>
+    <w:p>
+      <w:pPr>
+        <w:pStyle w:val="ListNumber"/>
+        <w:spacing w:after="80"/>
+      </w:pPr>
+      <w:r>
+        <w:t>Corriger les informations proposées et ignorer les lignes qui ne doivent pas être importées.</w:t>
+      </w:r>
+    </w:p>
+    <w:p>
+      <w:pPr>
+        <w:pStyle w:val="ListNumber"/>
+        <w:spacing w:after="80"/>
+      </w:pPr>
+      <w:r>
+        <w:t>Lancer la validation métier ; aucune donnée définitive n'est créée tant que les erreurs bloquantes subsistent.</w:t>
+      </w:r>
+    </w:p>
+    <w:p>
+      <w:pPr>
+        <w:pStyle w:val="ListNumber"/>
+        <w:spacing w:after="80"/>
+      </w:pPr>
+      <w:r>
+        <w:t>Générer le fichier canonique ou confirmer l'import final.</w:t>
+      </w:r>
+    </w:p>
+    <w:p>
+      <w:pPr>
+        <w:pStyle w:val="ListNumber"/>
+        <w:spacing w:after="80"/>
+      </w:pPr>
+      <w:r>
+        <w:t>Contrôler le rapport d'import et l'historique des corrections.</w:t>
+      </w:r>
+    </w:p>
+    <w:tbl>
+      <w:tblPr>
+        <w:tblW w:type="dxa" w:w="9360"/>
+        <w:jc w:val="left"/>
+        <w:tblLayout w:type="fixed"/>
+        <w:tblLook w:firstColumn="1" w:firstRow="1" w:lastColumn="0" w:lastRow="0" w:noHBand="0" w:noVBand="1" w:val="04A0"/>
+        <w:tblInd w:w="120" w:type="dxa"/>
+      </w:tblPr>
+      <w:tblGrid>
+        <w:gridCol w:w="9360"/>
+      </w:tblGrid>
+      <w:tr>
+        <w:trPr>
+          <w:tblHeader w:val="true"/>
+        </w:trPr>
+        <w:tc>
+          <w:tcPr>
+            <w:tcW w:type="dxa" w:w="9360"/>
+            <w:shd w:fill="F4F6F9"/>
+            <w:tcMar>
+              <w:top w:w="120" w:type="dxa"/>
+              <w:start w:w="160" w:type="dxa"/>
+              <w:bottom w:w="120" w:type="dxa"/>
+              <w:end w:w="160" w:type="dxa"/>
+            </w:tcMar>
+          </w:tcPr>
+          <w:p>
+            <w:r>
+              <w:rPr>
+                <w:rFonts w:ascii="Calibri" w:hAnsi="Calibri"/>
+                <w:b/>
+                <w:color w:val="0B2545"/>
+                <w:sz w:val="22"/>
+              </w:rPr>
+              <w:t xml:space="preserve">Validation humaine obligatoire : </w:t>
+            </w:r>
+            <w:r>
+              <w:rPr>
+                <w:rFonts w:ascii="Calibri" w:hAnsi="Calibri"/>
+                <w:color w:val="000000"/>
+                <w:sz w:val="22"/>
+              </w:rPr>
+              <w:t>L'IA facilite l'extraction et la rédaction, mais elle ne valide jamais seule un PTA, une action ou un rapport institutionnel.</w:t>
+            </w:r>
+          </w:p>
+        </w:tc>
+      </w:tr>
+    </w:tbl>
+    <w:p/>
     <w:p>
       <w:pPr>
         <w:pStyle w:val="Heading1"/>
@@ -6198,6 +7554,9 @@
         <w:gridCol w:w="6960"/>
       </w:tblGrid>
       <w:tr>
+        <w:trPr>
+          <w:tblHeader w:val="true"/>
+        </w:trPr>
         <w:tc>
           <w:tcPr>
             <w:tcW w:type="dxa" w:w="2400"/>
@@ -6590,6 +7949,9 @@
         <w:gridCol w:w="3460"/>
       </w:tblGrid>
       <w:tr>
+        <w:trPr>
+          <w:tblHeader w:val="true"/>
+        </w:trPr>
         <w:tc>
           <w:tcPr>
             <w:tcW w:type="dxa" w:w="2600"/>
@@ -6950,7 +8312,7 @@
                 <w:color w:val="000000"/>
                 <w:sz w:val="18"/>
               </w:rPr>
-              <w:t>La performance est encore provisoire.</w:t>
+              <w:t>La performance est encore provisoire ou en contrôle.</w:t>
             </w:r>
           </w:p>
         </w:tc>
@@ -6975,7 +8337,7 @@
                 <w:color w:val="000000"/>
                 <w:sz w:val="18"/>
               </w:rPr>
-              <w:t>Attendre ou demander la validation du chef.</w:t>
+              <w:t>Vérifier le visa du chef et la validation finale Planification/SCIQ.</w:t>
             </w:r>
           </w:p>
         </w:tc>
@@ -7002,7 +8364,7 @@
                 <w:color w:val="000000"/>
                 <w:sz w:val="18"/>
               </w:rPr>
-              <w:t>Je dois modifier une action figée</w:t>
+              <w:t>Je dois modifier une date</w:t>
             </w:r>
           </w:p>
         </w:tc>
@@ -7027,7 +8389,7 @@
                 <w:color w:val="000000"/>
                 <w:sz w:val="18"/>
               </w:rPr>
-              <w:t>L'action est enregistrée et verrouillée.</w:t>
+              <w:t>Les dates sont protégées par le circuit de report.</w:t>
             </w:r>
           </w:p>
         </w:tc>
@@ -7052,7 +8414,84 @@
                 <w:color w:val="000000"/>
                 <w:sz w:val="18"/>
               </w:rPr>
-              <w:t>Utiliser Demande de modification et saisir un motif clair.</w:t>
+              <w:t>Ouvrir l'onglet Échéances, joindre une preuve et soumettre une demande de report.</w:t>
+            </w:r>
+          </w:p>
+        </w:tc>
+      </w:tr>
+      <w:tr>
+        <w:tc>
+          <w:tcPr>
+            <w:tcW w:type="dxa" w:w="2600"/>
+            <w:tcMar>
+              <w:top w:w="80" w:type="dxa"/>
+              <w:start w:w="120" w:type="dxa"/>
+              <w:bottom w:w="80" w:type="dxa"/>
+              <w:end w:w="120" w:type="dxa"/>
+            </w:tcMar>
+            <w:vAlign w:val="center"/>
+          </w:tcPr>
+          <w:p>
+            <w:pPr>
+              <w:spacing w:after="0"/>
+            </w:pPr>
+            <w:r>
+              <w:rPr>
+                <w:rFonts w:ascii="Calibri" w:hAnsi="Calibri"/>
+                <w:color w:val="000000"/>
+                <w:sz w:val="18"/>
+              </w:rPr>
+              <w:t>Le mauvais formulaire s'affiche</w:t>
+            </w:r>
+          </w:p>
+        </w:tc>
+        <w:tc>
+          <w:tcPr>
+            <w:tcW w:type="dxa" w:w="3300"/>
+            <w:tcMar>
+              <w:top w:w="80" w:type="dxa"/>
+              <w:start w:w="120" w:type="dxa"/>
+              <w:bottom w:w="80" w:type="dxa"/>
+              <w:end w:w="120" w:type="dxa"/>
+            </w:tcMar>
+            <w:vAlign w:val="center"/>
+          </w:tcPr>
+          <w:p>
+            <w:pPr>
+              <w:spacing w:after="0"/>
+            </w:pPr>
+            <w:r>
+              <w:rPr>
+                <w:rFonts w:ascii="Calibri" w:hAnsi="Calibri"/>
+                <w:color w:val="000000"/>
+                <w:sz w:val="18"/>
+              </w:rPr>
+              <w:t>Un autre onglet de suivi est actif.</w:t>
+            </w:r>
+          </w:p>
+        </w:tc>
+        <w:tc>
+          <w:tcPr>
+            <w:tcW w:type="dxa" w:w="3460"/>
+            <w:tcMar>
+              <w:top w:w="80" w:type="dxa"/>
+              <w:start w:w="120" w:type="dxa"/>
+              <w:bottom w:w="80" w:type="dxa"/>
+              <w:end w:w="120" w:type="dxa"/>
+            </w:tcMar>
+            <w:vAlign w:val="center"/>
+          </w:tcPr>
+          <w:p>
+            <w:pPr>
+              <w:spacing w:after="0"/>
+            </w:pPr>
+            <w:r>
+              <w:rPr>
+                <w:rFonts w:ascii="Calibri" w:hAnsi="Calibri"/>
+                <w:color w:val="000000"/>
+                <w:sz w:val="18"/>
+              </w:rPr>
+              <w:t>Choisir l'onglet Validation, Échéances, Financement ou Justificatifs correspondant à l'opération.</w:t>
             </w:r>
           </w:p>
         </w:tc>
@@ -7235,6 +8674,9 @@
         <w:gridCol w:w="7060"/>
       </w:tblGrid>
       <w:tr>
+        <w:trPr>
+          <w:tblHeader w:val="true"/>
+        </w:trPr>
         <w:tc>
           <w:tcPr>
             <w:tcW w:type="dxa" w:w="2300"/>
@@ -7728,7 +9170,7 @@
                 <w:color w:val="000000"/>
                 <w:sz w:val="18"/>
               </w:rPr>
-              <w:t>Validation chef</w:t>
+              <w:t>Visa du chef</w:t>
             </w:r>
           </w:p>
         </w:tc>
@@ -7753,7 +9195,59 @@
                 <w:color w:val="000000"/>
                 <w:sz w:val="18"/>
               </w:rPr>
-              <w:t>Décision qui officialise la performance.</w:t>
+              <w:t>Décision hiérarchique qui transmet le suivi au contrôle final ou le retourne en correction.</w:t>
+            </w:r>
+          </w:p>
+        </w:tc>
+      </w:tr>
+      <w:tr>
+        <w:tc>
+          <w:tcPr>
+            <w:tcW w:type="dxa" w:w="2300"/>
+            <w:tcMar>
+              <w:top w:w="80" w:type="dxa"/>
+              <w:start w:w="120" w:type="dxa"/>
+              <w:bottom w:w="80" w:type="dxa"/>
+              <w:end w:w="120" w:type="dxa"/>
+            </w:tcMar>
+            <w:vAlign w:val="center"/>
+          </w:tcPr>
+          <w:p>
+            <w:pPr>
+              <w:spacing w:after="0"/>
+            </w:pPr>
+            <w:r>
+              <w:rPr>
+                <w:rFonts w:ascii="Calibri" w:hAnsi="Calibri"/>
+                <w:color w:val="000000"/>
+                <w:sz w:val="18"/>
+              </w:rPr>
+              <w:t>Validation du contrôle</w:t>
+            </w:r>
+          </w:p>
+        </w:tc>
+        <w:tc>
+          <w:tcPr>
+            <w:tcW w:type="dxa" w:w="7060"/>
+            <w:tcMar>
+              <w:top w:w="80" w:type="dxa"/>
+              <w:start w:w="120" w:type="dxa"/>
+              <w:bottom w:w="80" w:type="dxa"/>
+              <w:end w:w="120" w:type="dxa"/>
+            </w:tcMar>
+            <w:vAlign w:val="center"/>
+          </w:tcPr>
+          <w:p>
+            <w:pPr>
+              <w:spacing w:after="0"/>
+            </w:pPr>
+            <w:r>
+              <w:rPr>
+                <w:rFonts w:ascii="Calibri" w:hAnsi="Calibri"/>
+                <w:color w:val="000000"/>
+                <w:sz w:val="18"/>
+              </w:rPr>
+              <w:t>Décision Planification/SCIQ qui officialise la performance et clôture le circuit.</w:t>
             </w:r>
           </w:p>
         </w:tc>

</xml_diff>